<commit_message>
Record migration reconciliation GitHub delivery evidence
</commit_message>
<xml_diff>
--- a/docs/reports/2026-10-16-migration-history-reconciliation.docx
+++ b/docs/reports/2026-10-16-migration-history-reconciliation.docx
@@ -645,7 +645,7 @@
     </w:p>
     <w:p>
       <w:r>
-        <w:t>Delivery uses the existing codex/phase-1-auth-recovery review branch. Commit/push evidence will be recorded after explicit staged-file review. Production is not promoted. This slice adds no application route or new hosted migration.</w:t>
+        <w:t>Delivery uses the existing codex/phase-1-auth-recovery review branch. Source/report commit 9adda05 was pushed successfully to origin; git ls-remote independently confirms the remote branch. Only the thirteen reviewed files were staged, and the next-env.d.ts edit remains unstaged. Staged diff validation passes. Production is not promoted. This slice adds no application route or new hosted migration.</w:t>
       </w:r>
     </w:p>
     <w:p>
@@ -711,7 +711,7 @@
     </w:p>
     <w:p>
       <w:r>
-        <w:t>The matching Word report uses the established compact_reference_guide preset, memo_masthead pattern and existing named report-style overrides. Structural/link/ privacy checks pass. The renderer was attempted and failed because LibreOffice is absent (WinError 2). Visual pagination is unverified; no human signoff is claimed.</w:t>
+        <w:t>The matching Word report uses the established compact_reference_guide preset, memo_masthead pattern and existing named report-style overrides. Structural/link/ privacy checks pass, including 183 local links and ten normalized hosted SHA-256 matches after removing trailing blank lines from the two recovered files. The renderer was attempted and failed because LibreOffice is absent (WinError 2). Visual pagination is unverified; no human signoff is claimed.</w:t>
       </w:r>
     </w:p>
     <w:sectPr>

</xml_diff>